<commit_message>
docs: ajout coûts passage à l'échelle et coût humain dans budget
https://claude.ai/code/session_01Pk49MTzVgKFhQkav57rAyE
</commit_message>
<xml_diff>
--- a/Note_de_cadrage_Explorateur_Solaire_IDEX.docx
+++ b/Note_de_cadrage_Explorateur_Solaire_IDEX.docx
@@ -5252,6 +5252,200 @@
                 <w:rFonts w:cs="Arial"/>
               </w:rPr>
               <w:t>≤ 300 € hors coûts internes — budget solution ≤ 10 000 € (conforme objectif)</w:t>
+            </w:r>
+          </w:p>
+        </w:tc>
+      </w:tr>
+      <w:tr>
+        <w:tc>
+          <w:tcPr>
+            <w:tcW w:type="dxa" w:w="4500"/>
+          </w:tcPr>
+          <w:p>
+            <w:r>
+              <w:t>── PASSAGE À L'ÉCHELLE (post-POC national) ──</w:t>
+            </w:r>
+          </w:p>
+        </w:tc>
+        <w:tc>
+          <w:tcPr>
+            <w:tcW w:type="dxa" w:w="1500"/>
+          </w:tcPr>
+          <w:p>
+            <w:r/>
+          </w:p>
+        </w:tc>
+      </w:tr>
+      <w:tr>
+        <w:tc>
+          <w:tcPr>
+            <w:tcW w:type="dxa" w:w="4500"/>
+          </w:tcPr>
+          <w:p>
+            <w:r>
+              <w:t>Pappers — volume national (~50 000 magasins)</w:t>
+            </w:r>
+          </w:p>
+        </w:tc>
+        <w:tc>
+          <w:tcPr>
+            <w:tcW w:type="dxa" w:w="1500"/>
+          </w:tcPr>
+          <w:p>
+            <w:r>
+              <w:t>2 000 – 5 000 €</w:t>
+            </w:r>
+          </w:p>
+        </w:tc>
+      </w:tr>
+      <w:tr>
+        <w:tc>
+          <w:tcPr>
+            <w:tcW w:type="dxa" w:w="4500"/>
+          </w:tcPr>
+          <w:p>
+            <w:r>
+              <w:t>API Anthropic Claude — volume ×50</w:t>
+            </w:r>
+          </w:p>
+        </w:tc>
+        <w:tc>
+          <w:tcPr>
+            <w:tcW w:type="dxa" w:w="1500"/>
+          </w:tcPr>
+          <w:p>
+            <w:r>
+              <w:t>500 – 1 500 €</w:t>
+            </w:r>
+          </w:p>
+        </w:tc>
+      </w:tr>
+      <w:tr>
+        <w:tc>
+          <w:tcPr>
+            <w:tcW w:type="dxa" w:w="4500"/>
+          </w:tcPr>
+          <w:p>
+            <w:r>
+              <w:t>Relevés SPF — top 200 leads national</w:t>
+            </w:r>
+          </w:p>
+        </w:tc>
+        <w:tc>
+          <w:tcPr>
+            <w:tcW w:type="dxa" w:w="1500"/>
+          </w:tcPr>
+          <w:p>
+            <w:r>
+              <w:t>~2 400 € (12 €/parcelle)</w:t>
+            </w:r>
+          </w:p>
+        </w:tc>
+      </w:tr>
+      <w:tr>
+        <w:tc>
+          <w:tcPr>
+            <w:tcW w:type="dxa" w:w="4500"/>
+          </w:tcPr>
+          <w:p>
+            <w:r>
+              <w:t>Airtable — plan Team (équipe &gt; 5)</w:t>
+            </w:r>
+          </w:p>
+        </w:tc>
+        <w:tc>
+          <w:tcPr>
+            <w:tcW w:type="dxa" w:w="1500"/>
+          </w:tcPr>
+          <w:p>
+            <w:r>
+              <w:t>~240 €/an</w:t>
+            </w:r>
+          </w:p>
+        </w:tc>
+      </w:tr>
+      <w:tr>
+        <w:tc>
+          <w:tcPr>
+            <w:tcW w:type="dxa" w:w="4500"/>
+          </w:tcPr>
+          <w:p>
+            <w:r>
+              <w:t>Serveur n8n dédié (VPS)</w:t>
+            </w:r>
+          </w:p>
+        </w:tc>
+        <w:tc>
+          <w:tcPr>
+            <w:tcW w:type="dxa" w:w="1500"/>
+          </w:tcPr>
+          <w:p>
+            <w:r>
+              <w:t>~240 €/an (~20 €/mois)</w:t>
+            </w:r>
+          </w:p>
+        </w:tc>
+      </w:tr>
+      <w:tr>
+        <w:tc>
+          <w:tcPr>
+            <w:tcW w:type="dxa" w:w="4500"/>
+          </w:tcPr>
+          <w:p>
+            <w:r>
+              <w:t>Budget total passage à l'échelle</w:t>
+            </w:r>
+          </w:p>
+        </w:tc>
+        <w:tc>
+          <w:tcPr>
+            <w:tcW w:type="dxa" w:w="1500"/>
+          </w:tcPr>
+          <w:p>
+            <w:r>
+              <w:t>5 000 – 10 000 € (conforme objectif Idex)</w:t>
+            </w:r>
+          </w:p>
+        </w:tc>
+      </w:tr>
+      <w:tr>
+        <w:tc>
+          <w:tcPr>
+            <w:tcW w:type="dxa" w:w="4500"/>
+          </w:tcPr>
+          <w:p>
+            <w:r>
+              <w:t>── COÛT HUMAIN À BUDGÉTER ──</w:t>
+            </w:r>
+          </w:p>
+        </w:tc>
+        <w:tc>
+          <w:tcPr>
+            <w:tcW w:type="dxa" w:w="1500"/>
+          </w:tcPr>
+          <w:p>
+            <w:r/>
+          </w:p>
+        </w:tc>
+      </w:tr>
+      <w:tr>
+        <w:tc>
+          <w:tcPr>
+            <w:tcW w:type="dxa" w:w="4500"/>
+          </w:tcPr>
+          <w:p>
+            <w:r>
+              <w:t>Revue humaine leads « À vérifier » (est. 40 % des leads, 15-30 min/lead)</w:t>
+            </w:r>
+          </w:p>
+        </w:tc>
+        <w:tc>
+          <w:tcPr>
+            <w:tcW w:type="dxa" w:w="1500"/>
+          </w:tcPr>
+          <w:p>
+            <w:r>
+              <w:t>~10 à 20 h chargé d'affaires sur le POC — à intégrer dans le planning commercial</w:t>
             </w:r>
           </w:p>
         </w:tc>

</xml_diff>